<commit_message>
Encaje: las tres condiciones son para usar el catálogo como modelo; sus soluciones de redacción, desde ya
La cautela del §6 decía «antes de incorporar cualquier cláusula a un expediente» y contradecía la caja de
estado del catálogo, que permite usar sus soluciones de redacción justificadas con datos propios.

Co-Authored-By: Claude Opus 5.5 <noreply@anthropic.com>
</commit_message>
<xml_diff>
--- a/docs/descargas/complementarios/encaje-ladia.docx
+++ b/docs/descargas/complementarios/encaje-ladia.docx
@@ -145,7 +145,7 @@
         </w:rPr>
         <w:t xml:space="preserve">Documento complementario de AI Clauses, versión 4.0. Coteja el catálogo con el proyecto de ley; no sustituye a ninguno de los dos. Donde este documento y el catálogo discrepen, manda el catálogo. </w:t>
       </w:r>
-      <w:hyperlink w:history="1" r:id="rId5dn5q1--41vesm-4im94q">
+      <w:hyperlink w:history="1" r:id="rIdwjtkups_6_aigj4niz5sv">
         <w:r>
           <w:rPr>
             <w:rFonts w:ascii="Calibri" w:cs="Calibri" w:eastAsia="Calibri" w:hAnsi="Calibri"/>
@@ -205,7 +205,7 @@
         </w:rPr>
         <w:t xml:space="preserve">Texto cotejado: proyecto de Ley de la Administración Digital e Inteligencia Artificial de la Comunidad de Madrid (texto anexo al Acuerdo del Consejo de Gobierno de 9 de septiembre de 2026; Proyecto de Ley PL-11/2026, </w:t>
       </w:r>
-      <w:hyperlink w:history="1" r:id="rIdej2gm41fhwyji0e2jjh8v">
+      <w:hyperlink w:history="1" r:id="rIdmflcvavjdxhz9zj62pvva">
         <w:r>
           <w:rPr>
             <w:rFonts w:ascii="Calibri" w:cs="Calibri" w:eastAsia="Calibri" w:hAnsi="Calibri"/>
@@ -301,7 +301,7 @@
         </w:rPr>
         <w:t xml:space="preserve"> para saber, precepto a precepto, qué deberes del proyecto pueden trasladarse ya a los contratos con cláusulas redactadas y con su medio de prueba, y cuáles no; y para reutilizarlas en sus propios pliegos, porque el catálogo es abierto (CC BY 4.0) y prevé las adaptaciones para otra administración (Parte I, §2.3). Quién lo firma: </w:t>
       </w:r>
-      <w:hyperlink w:history="1" r:id="rIdsphdy540fk4mi_5ag2kv8">
+      <w:hyperlink w:history="1" r:id="rIdktoigktieuzmu8l3cfsdi">
         <w:r>
           <w:rPr>
             <w:rFonts w:ascii="Georgia" w:cs="Georgia" w:eastAsia="Georgia" w:hAnsi="Georgia"/>
@@ -326,7 +326,7 @@
         </w:rPr>
         <w:t xml:space="preserve">; sus vinculaciones con el sector y el estado de las declaraciones de conflicto de interés, en la </w:t>
       </w:r>
-      <w:hyperlink w:history="1" r:id="rId6-jo18qfl0elwpe6b6sbd">
+      <w:hyperlink w:history="1" r:id="rId62bwzghurogr6iktbnyet">
         <w:r>
           <w:rPr>
             <w:rFonts w:ascii="Georgia" w:cs="Georgia" w:eastAsia="Georgia" w:hAnsi="Georgia"/>
@@ -639,7 +639,7 @@
         </w:rPr>
         <w:t xml:space="preserve"> Si se aprueba, entrará en vigor a los veinte días de publicarse en el BOCM (disposición final quinta) y se publicará también en el BOE (</w:t>
       </w:r>
-      <w:hyperlink w:history="1" r:id="rIdyryrgwul8m77shxj2ey86">
+      <w:hyperlink w:history="1" r:id="rIdjjk_-q7gmly0ha-ka9h_n">
         <w:r>
           <w:rPr>
             <w:rFonts w:ascii="Calibri" w:cs="Calibri" w:eastAsia="Calibri" w:hAnsi="Calibri"/>
@@ -809,7 +809,7 @@
         </w:rPr>
         <w:t xml:space="preserve"> Tras el </w:t>
       </w:r>
-      <w:hyperlink w:history="1" r:id="rIdghkzs070o3rgwm8qx8axa">
+      <w:hyperlink w:history="1" r:id="rIdcs77wwnqnt5wu71ya1o6z">
         <w:r>
           <w:rPr>
             <w:rFonts w:ascii="Calibri" w:cs="Calibri" w:eastAsia="Calibri" w:hAnsi="Calibri"/>
@@ -10327,7 +10327,7 @@
           <w:sz w:val="21"/>
           <w:szCs w:val="21"/>
         </w:rPr>
-        <w:t xml:space="preserve"> Su memoria fija tres condiciones antes de incorporar cualquier cláusula a un expediente: acuerdo del órgano de gobierno que apruebe el plan, el catálogo y el Anexo V; consulta preliminar del mercado con contraste documentado del Anexo V, y declaraciones de conflicto de interés firmadas (Parte IV, §M11, filas 1 a 3).</w:t>
+        <w:t xml:space="preserve"> Su memoria fija tres condiciones para incorporar sus cláusulas a un expediente como cláusulas del catálogo, es decir, citándolo como modelo: acuerdo del órgano de gobierno que apruebe el plan, el catálogo y el Anexo V; consulta preliminar del mercado con contraste documentado del Anexo V, y declaraciones de conflicto de interés firmadas (Parte IV, §M11, filas 1 a 3). Sus soluciones de redacción pueden usarse desde ya, justificadas con datos propios del expediente y sin remitirse al catálogo.</w:t>
       </w:r>
     </w:p>
     <w:p>

</xml_diff>